<commit_message>
docx received: 9-page matrix confirmed against live UI, instruction updated with mandatory SUDOP attachment, checklist 97 PASS
</commit_message>
<xml_diff>
--- a/docs/Instrukcja_RWS_powtorna_podanie_OLGA.docx
+++ b/docs/Instrukcja_RWS_powtorna_podanie_OLGA.docx
@@ -71,6 +71,15 @@
       </w:pPr>
       <w:r>
         <w:t>Informacje o pomocy de minimis otrzymanej w ciągu 3 poprzednich lat.</w:t>
+      </w:r>
+    </w:p>
+    <w:p>
+      <w:pPr>
+        <w:pStyle w:val="ListBullet"/>
+        <w:spacing w:after="60"/>
+      </w:pPr>
+      <w:r>
+        <w:t>Plik PDF ze sfery «Wyszukiwanie pomocy otrzymanej przez beneficjenta» (SUDOP) — pobierz go w kroku 1, jeśli składasz wniosek kolejny raz.</w:t>
       </w:r>
     </w:p>
     <w:p>
@@ -1008,6 +1017,16 @@
     <w:p>
       <w:r>
         <w:rPr>
+          <w:b/>
+          <w:i w:val="0"/>
+          <w:sz w:val="22"/>
+        </w:rPr>
+        <w:t>Ważne: przy kolejnym wniosku (nie pierwszym) instrukcja wymaga dołączenia pliku pobranego na początku z SUDOP — «przypadki_pomocy_beneficjenta.pdf». To ten sam dokument, o którym mowa w rozdziale 1. Bez niego wniosek nie zawiera historii pomocy de minimis.</w:t>
+      </w:r>
+    </w:p>
+    <w:p>
+      <w:r>
+        <w:rPr>
           <w:b w:val="0"/>
           <w:i w:val="0"/>
           <w:sz w:val="22"/>

</xml_diff>

<commit_message>
instruction: step 9 exact field, allowed formats, 1MB/5MB limits
</commit_message>
<xml_diff>
--- a/docs/Instrukcja_RWS_powtorna_podanie_OLGA.docx
+++ b/docs/Instrukcja_RWS_powtorna_podanie_OLGA.docx
@@ -1027,6 +1027,16 @@
     <w:p>
       <w:r>
         <w:rPr>
+          <w:b/>
+          <w:i w:val="0"/>
+          <w:sz w:val="22"/>
+        </w:rPr>
+        <w:t>Krok 9 to pole upuszczania plików z podpisem «Kliknij tutaj, aby dodać plik, lub przeciągnij go na to pole». Dozwolone formaty obejmują .pdf, limit to 1 MB na plik i 5 MB łącznie — pobrane z SUDOP są małe (25,63 KB w dokumencie źródłowym), więc mieszczą się bez problemu.</w:t>
+      </w:r>
+    </w:p>
+    <w:p>
+      <w:r>
+        <w:rPr>
           <w:b w:val="0"/>
           <w:i w:val="0"/>
           <w:sz w:val="22"/>

</xml_diff>